<commit_message>
Add contextual chunking as a secondary improvement in Section 9
Section 9.7 documents the structure-aware + contextual-chunking
upgrade (replacing the original fixed-word chunker/MiniLM/FAISS
setup) alongside the dense-vs-hybrid retrieval experiment. Since this
change predates the dense-vs-hybrid comparison and applies to both
arms, it's reported qualitatively rather than as an isolated A/B
test, with the verified fact that all 1,809 chunks in the live index
were successfully contextualized (0 fallbacks), plus honest
trade-offs (ingestion cost/time, separate LLM quota dependency).
</commit_message>
<xml_diff>
--- a/deliverables/Project_Report.docx
+++ b/deliverables/Project_Report.docx
@@ -2248,6 +2248,60 @@
     </w:p>
     <w:p>
       <w:pPr>
+        <w:pStyle w:val="Heading2"/>
+        <w:spacing w:before="160" w:after="40"/>
+      </w:pPr>
+      <w:r>
+        <w:rPr>
+          <w:b/>
+          <w:color w:val="2E2E2E"/>
+          <w:sz w:val="23"/>
+        </w:rPr>
+        <w:t>9.7 Secondary improvement: structure-aware and contextual chunking</w:t>
+      </w:r>
+    </w:p>
+    <w:p>
+      <w:r>
+        <w:rPr>
+          <w:b w:val="0"/>
+          <w:i w:val="0"/>
+          <w:sz w:val="21"/>
+        </w:rPr>
+        <w:t>Before the dense-vs-hybrid retrieval experiment above, the ingestion pipeline itself was upgraded: the project's original fixed 350/50-word chunker (paired with all-MiniLM-L6-v2 embeddings and a FAISS index) was replaced with (a) a two-stage structure-aware chunker that packs whole paragraphs and only falls back to fixed-word splitting for an oversized paragraph, and (b) an optional contextual-chunking step that prepends a short LLM-generated sentence describing where each chunk sits in its source document before embedding (see Section 4).</w:t>
+      </w:r>
+    </w:p>
+    <w:p>
+      <w:r>
+        <w:rPr>
+          <w:b w:val="0"/>
+          <w:i w:val="0"/>
+          <w:sz w:val="21"/>
+        </w:rPr>
+        <w:t>What problem this was intended to solve: fixed-word-count splitting with no boundary awareness risked cutting an eligibility condition list mid-sentence, and a chunk embedded in isolation can lose the document-level context (which scheme, which section) that helps a dense embedding tell apart short, generically-worded passages — such as a table row of dollar amounts — from similar-looking passages in other schemes.</w:t>
+      </w:r>
+    </w:p>
+    <w:p>
+      <w:r>
+        <w:rPr>
+          <w:b w:val="0"/>
+          <w:i w:val="0"/>
+          <w:sz w:val="21"/>
+        </w:rPr>
+        <w:t>Because this chunking and embedding upgrade was applied before the dense-vs-hybrid comparison in Sections 7–9 was run, both the dense and hybrid arms reported above already benefit from it — there is no isolated “with vs. without contextual chunking” baseline in this evaluation to compare against, and this report does not claim one. What was verified instead is that contextualization actually ran, rather than silently degrading to its fail-open raw-text path: comparing embed_text against text for every record in the live index (data/chroma/metadata.jsonl) shows 1,809 of 1,809 chunks (100%) received a prepended context sentence, with zero fallbacks across all three modalities (text, image, video).</w:t>
+      </w:r>
+    </w:p>
+    <w:p>
+      <w:r>
+        <w:rPr>
+          <w:b w:val="0"/>
+          <w:i w:val="0"/>
+          <w:sz w:val="19"/>
+        </w:rPr>
+        <w:t>Trade-offs: this improvement is not free. Contextualizing the full corpus adds a one-time LLM cost and ingestion time (estimated at roughly $0.06 and 8–12 minutes for the corpus's text chunks, priced against gpt-5.4-mini) that recurs on every full reingestion, and it depends on a second LLM provider quota, kept deliberately separate from the live-query provider after the team hit Groq's 100K-token/day cap once during development. A per-chunk fail-open path plus a 5-consecutive-failure circuit breaker mean a partial outage degrades gracefully to the pre-existing plain-chunk baseline rather than blocking ingestion — but it also means the 100% coverage figure above is a property of this particular successful run, not a structural guarantee for every future reingestion.</w:t>
+      </w:r>
+    </w:p>
+    <w:p>
+      <w:pPr>
         <w:pStyle w:val="Heading1"/>
         <w:spacing w:before="280" w:after="80"/>
       </w:pPr>

</xml_diff>

<commit_message>
Update project report with Group 2 contributions and current features.
Fill member roles, document chat history and shortlist alignment, soften heuristic-router wording, and align corpus counts with metadata.jsonl.

Co-authored-by: Cursor <cursoragent@cursor.com>
</commit_message>
<xml_diff>
--- a/deliverables/Project_Report.docx
+++ b/deliverables/Project_Report.docx
@@ -51,22 +51,21 @@
         <w:rPr>
           <w:sz w:val="21"/>
         </w:rPr>
-        <w:t>Group: [Group Name / Number]</w:t>
+        <w:t>Group: Group 2</w:t>
         <w:br/>
+        <w:t>Date: 30 July 2026</w:t>
+        <w:br/>
+        <w:t>Domain: Public-Sector Information &amp; Service Guides</w:t>
       </w:r>
       <w:r>
         <w:rPr>
           <w:sz w:val="21"/>
         </w:rPr>
-        <w:t>Date: 30 July 2026</w:t>
-        <w:br/>
       </w:r>
       <w:r>
         <w:rPr>
           <w:sz w:val="21"/>
         </w:rPr>
-        <w:t>Domain: Public-Sector Information &amp; Service Guides</w:t>
-        <w:br/>
       </w:r>
     </w:p>
     <w:p>
@@ -129,7 +128,7 @@
           <w:i w:val="0"/>
           <w:sz w:val="21"/>
         </w:rPr>
-        <w:t>The knowledge base contains 385 source documents indexed into 1,809 chunks in a persistent ChromaDB collection (sg_financial_assistant). It spans three modalities — exceeding the assignment's minimum of two — covering official Singapore government scheme pages, tax-relief guidance, and supporting apprenticeship/programme materials:</w:t>
+        <w:t>The knowledge base contains 385 source documents indexed into 1,809 chunks in a persistent ChromaDB collection (sg_financial_assistant; counts taken from data/chroma/metadata.jsonl at the 30 July 2026 evaluation rebuild). It spans three modalities — exceeding the assignment's minimum of two — covering official Singapore government scheme pages, tax-relief guidance, and supporting apprenticeship/programme materials:</w:t>
       </w:r>
     </w:p>
     <w:tbl>
@@ -539,7 +538,7 @@
           <w:i w:val="0"/>
           <w:sz w:val="21"/>
         </w:rPr>
-        <w:t>A minimal Gradio app (backend/gradio_app.py) reuses the identical retrieval and generation modules as a demo-day fallback UI. Beyond simple retrieve-then-generate, the pipeline includes several agentic components:</w:t>
+        <w:t>A minimal Gradio app (backend/gradio_app.py) reuses the identical retrieval and generation modules as a demo-day fallback UI. Beyond simple retrieve-then-generate, the pipeline includes several light agent/heuristic components:</w:t>
       </w:r>
     </w:p>
     <w:p>
@@ -566,11 +565,9 @@
         <w:rPr>
           <w:b/>
         </w:rPr>
-        <w:t xml:space="preserve">Intent router — </w:t>
+        <w:t>Intent router (light heuristic) — a keyword-count classifier decides whether a free-text question is a plain scheme-fact question or a personal-situation question, routing the latter into the eligibility-shortlist path. This is not a learned planner; it is a deliberate, inspectable heuristic.</w:t>
       </w:r>
-      <w:r>
-        <w:t>a heuristic classifier decides whether a free-text question is a plain scheme-fact question or a personal-situation question, routing the latter into the eligibility-shortlist path.</w:t>
-      </w:r>
+      <w:r/>
     </w:p>
     <w:p>
       <w:pPr>
@@ -632,6 +629,7 @@
         <w:t>Singapore NRIC/FIN-shaped identifiers are regex-redacted before any query reaches an LLM, including the rewriter.</w:t>
       </w:r>
     </w:p>
+    <w:p/>
     <w:p>
       <w:pPr>
         <w:pStyle w:val="ListBullet"/>
@@ -645,6 +643,22 @@
       </w:r>
       <w:r>
         <w:t>force-append retrieved-but-omitted schemes when a profile has a strong signal (e.g. an unemployed profile must surface SkillsFuture/ComCare/Workfare if those chunks were retrieved), and surface retrieved-but-unassessed schemes rather than returning an empty shortlist.</w:t>
+      </w:r>
+    </w:p>
+    <w:p>
+      <w:pPr>
+        <w:pStyle w:val="ListBullet"/>
+      </w:pPr>
+      <w:r>
+        <w:t>In-session chat history — General Q&amp;A and Personal Eligibility keep a short browser-tab conversation (sessionStorage, capped turns) plus a sticky profile; follow-ups such as “how much is that?” are rewritten into standalone retrieval queries. History is used only for reference resolution and is never treated as evidence for eligibility claims.</w:t>
+      </w:r>
+    </w:p>
+    <w:p>
+      <w:pPr>
+        <w:pStyle w:val="ListBullet"/>
+      </w:pPr>
+      <w:r>
+        <w:t>Freeform ↔ structured shortlist alignment — personal-situation free text in General Q&amp;A infers the same profile bands as the Personal Eligibility form, runs the same shortlist engine (profile-band retrieval seeds, unemployed → SkillsFuture/ComCare coverage nets), and can pre-fill the form ticks so both UIs return a consistent resident-facing shortlist.</w:t>
       </w:r>
     </w:p>
     <w:p>
@@ -1341,7 +1355,7 @@
           <w:i/>
           <w:sz w:val="19"/>
         </w:rPr>
-        <w:t>Run configuration: LLM gpt-5.4-mini via OpenAIClient; embedding model BAAI/bge-m3; top_k = 5; query rewrite off (to isolate the dense-vs-hybrid retrieval comparison); index of 385 documents / 1,809 chunks; run date 30 July 2026.</w:t>
+        <w:t>Run configuration: LLM gpt-5.4-mini via OpenAIClient; embedding model BAAI/bge-m3; top_k = 5; query rewrite off (to isolate the dense-vs-hybrid retrieval comparison); index of 385 documents / 1,809 chunks (same metadata.jsonl counts as §2); run date 30 July 2026.</w:t>
       </w:r>
     </w:p>
     <w:p>
@@ -2399,7 +2413,7 @@
           <w:i/>
           <w:sz w:val="19"/>
         </w:rPr>
-        <w:t>Suggested responsibility areas per the assignment brief; names and specific contributions to be completed by the group.</w:t>
+        <w:t>Responsibility areas follow the assignment brief. Names and key contributions are summarised in the table below (Group 2).</w:t>
       </w:r>
     </w:p>
     <w:tbl>
@@ -2473,12 +2487,8 @@
             <w:tcW w:type="dxa" w:w="2160"/>
           </w:tcPr>
           <w:p>
-            <w:r/>
             <w:r>
-              <w:rPr>
-                <w:sz w:val="19"/>
-              </w:rPr>
-              <w:t>[Name]</w:t>
+              <w:t>Hongming</w:t>
             </w:r>
           </w:p>
         </w:tc>
@@ -2487,11 +2497,7 @@
             <w:tcW w:type="dxa" w:w="2880"/>
           </w:tcPr>
           <w:p>
-            <w:r/>
             <w:r>
-              <w:rPr>
-                <w:sz w:val="19"/>
-              </w:rPr>
               <w:t>Data and ingestion</w:t>
             </w:r>
           </w:p>
@@ -2501,12 +2507,8 @@
             <w:tcW w:type="dxa" w:w="4320"/>
           </w:tcPr>
           <w:p>
-            <w:r/>
             <w:r>
-              <w:rPr>
-                <w:sz w:val="19"/>
-              </w:rPr>
-              <w:t>[Document collection, cleaning, chunking, metadata — fill in]</w:t>
+              <w:t>Document collection and cleaning; structure-aware chunking and optional LLM contextualization; metadata schema; multimodal ingestion (text/OCR/video transcription) into ChromaDB.</w:t>
             </w:r>
           </w:p>
         </w:tc>
@@ -2517,12 +2519,8 @@
             <w:tcW w:type="dxa" w:w="2160"/>
           </w:tcPr>
           <w:p>
-            <w:r/>
             <w:r>
-              <w:rPr>
-                <w:sz w:val="19"/>
-              </w:rPr>
-              <w:t>[Name]</w:t>
+              <w:t>Max</w:t>
             </w:r>
           </w:p>
         </w:tc>
@@ -2531,11 +2529,7 @@
             <w:tcW w:type="dxa" w:w="2880"/>
           </w:tcPr>
           <w:p>
-            <w:r/>
             <w:r>
-              <w:rPr>
-                <w:sz w:val="19"/>
-              </w:rPr>
               <w:t>Retrieval</w:t>
             </w:r>
           </w:p>
@@ -2545,12 +2539,8 @@
             <w:tcW w:type="dxa" w:w="4320"/>
           </w:tcPr>
           <w:p>
-            <w:r/>
             <w:r>
-              <w:rPr>
-                <w:sz w:val="19"/>
-              </w:rPr>
-              <w:t>[Embeddings, vector store, search, retrieval parameters — fill in]</w:t>
+              <w:t>BGE-M3 embeddings; Chroma dense baseline; BM25 + Reciprocal Rank Fusion hybrid retrieval; retrieval parameters, profile category re-ranking, and similarity abstention gate.</w:t>
             </w:r>
           </w:p>
         </w:tc>
@@ -2561,12 +2551,8 @@
             <w:tcW w:type="dxa" w:w="2160"/>
           </w:tcPr>
           <w:p>
-            <w:r/>
             <w:r>
-              <w:rPr>
-                <w:sz w:val="19"/>
-              </w:rPr>
-              <w:t>[Name]</w:t>
+              <w:t>Huimin</w:t>
             </w:r>
           </w:p>
         </w:tc>
@@ -2575,11 +2561,7 @@
             <w:tcW w:type="dxa" w:w="2880"/>
           </w:tcPr>
           <w:p>
-            <w:r/>
             <w:r>
-              <w:rPr>
-                <w:sz w:val="19"/>
-              </w:rPr>
               <w:t>Generation and application</w:t>
             </w:r>
           </w:p>
@@ -2589,12 +2571,8 @@
             <w:tcW w:type="dxa" w:w="4320"/>
           </w:tcPr>
           <w:p>
-            <w:r/>
             <w:r>
-              <w:rPr>
-                <w:sz w:val="19"/>
-              </w:rPr>
-              <w:t>[Prompt design, answer generation, citations, UI — fill in]</w:t>
+              <w:t>Prompt design and grounded answer generation; eligibility shortlist assessor; citations/UI; FastAPI backend and resident-facing frontend (including later chat-history and shortlist alignment work).</w:t>
             </w:r>
           </w:p>
         </w:tc>
@@ -2605,12 +2583,8 @@
             <w:tcW w:type="dxa" w:w="2160"/>
           </w:tcPr>
           <w:p>
-            <w:r/>
             <w:r>
-              <w:rPr>
-                <w:sz w:val="19"/>
-              </w:rPr>
-              <w:t>[Name]</w:t>
+              <w:t>Jony</w:t>
             </w:r>
           </w:p>
         </w:tc>
@@ -2619,11 +2593,7 @@
             <w:tcW w:type="dxa" w:w="2880"/>
           </w:tcPr>
           <w:p>
-            <w:r/>
             <w:r>
-              <w:rPr>
-                <w:sz w:val="19"/>
-              </w:rPr>
               <w:t>Evaluation and testing</w:t>
             </w:r>
           </w:p>
@@ -2633,12 +2603,8 @@
             <w:tcW w:type="dxa" w:w="4320"/>
           </w:tcPr>
           <w:p>
-            <w:r/>
             <w:r>
-              <w:rPr>
-                <w:sz w:val="19"/>
-              </w:rPr>
-              <w:t>[Test dataset, metrics, failure analysis, improvement — fill in]</w:t>
+              <w:t>Hand-labelled evaluation set; dense vs hybrid metrics and failure analysis; evaluation report; local reliability fixes, personal-eligibility parity testing, and rubric scoring.</w:t>
             </w:r>
           </w:p>
         </w:tc>

</xml_diff>

<commit_message>
Move Group 2 report updates to Project_Report_1.docx.
Keep the original deliverables/Project_Report.docx unchanged and put Group 2 roles, chat/shortlist notes, and corpus-count alignment in Project_Report_1.docx instead.

Co-authored-by: Cursor <cursoragent@cursor.com>
</commit_message>
<xml_diff>
--- a/deliverables/Project_Report.docx
+++ b/deliverables/Project_Report.docx
@@ -51,21 +51,22 @@
         <w:rPr>
           <w:sz w:val="21"/>
         </w:rPr>
-        <w:t>Group: Group 2</w:t>
+        <w:t>Group: [Group Name / Number]</w:t>
         <w:br/>
-        <w:t>Date: 30 July 2026</w:t>
-        <w:br/>
-        <w:t>Domain: Public-Sector Information &amp; Service Guides</w:t>
       </w:r>
       <w:r>
         <w:rPr>
           <w:sz w:val="21"/>
         </w:rPr>
+        <w:t>Date: 30 July 2026</w:t>
+        <w:br/>
       </w:r>
       <w:r>
         <w:rPr>
           <w:sz w:val="21"/>
         </w:rPr>
+        <w:t>Domain: Public-Sector Information &amp; Service Guides</w:t>
+        <w:br/>
       </w:r>
     </w:p>
     <w:p>
@@ -128,7 +129,7 @@
           <w:i w:val="0"/>
           <w:sz w:val="21"/>
         </w:rPr>
-        <w:t>The knowledge base contains 385 source documents indexed into 1,809 chunks in a persistent ChromaDB collection (sg_financial_assistant; counts taken from data/chroma/metadata.jsonl at the 30 July 2026 evaluation rebuild). It spans three modalities — exceeding the assignment's minimum of two — covering official Singapore government scheme pages, tax-relief guidance, and supporting apprenticeship/programme materials:</w:t>
+        <w:t>The knowledge base contains 385 source documents indexed into 1,809 chunks in a persistent ChromaDB collection (sg_financial_assistant). It spans three modalities — exceeding the assignment's minimum of two — covering official Singapore government scheme pages, tax-relief guidance, and supporting apprenticeship/programme materials:</w:t>
       </w:r>
     </w:p>
     <w:tbl>
@@ -538,7 +539,7 @@
           <w:i w:val="0"/>
           <w:sz w:val="21"/>
         </w:rPr>
-        <w:t>A minimal Gradio app (backend/gradio_app.py) reuses the identical retrieval and generation modules as a demo-day fallback UI. Beyond simple retrieve-then-generate, the pipeline includes several light agent/heuristic components:</w:t>
+        <w:t>A minimal Gradio app (backend/gradio_app.py) reuses the identical retrieval and generation modules as a demo-day fallback UI. Beyond simple retrieve-then-generate, the pipeline includes several agentic components:</w:t>
       </w:r>
     </w:p>
     <w:p>
@@ -565,9 +566,11 @@
         <w:rPr>
           <w:b/>
         </w:rPr>
-        <w:t>Intent router (light heuristic) — a keyword-count classifier decides whether a free-text question is a plain scheme-fact question or a personal-situation question, routing the latter into the eligibility-shortlist path. This is not a learned planner; it is a deliberate, inspectable heuristic.</w:t>
+        <w:t xml:space="preserve">Intent router — </w:t>
       </w:r>
-      <w:r/>
+      <w:r>
+        <w:t>a heuristic classifier decides whether a free-text question is a plain scheme-fact question or a personal-situation question, routing the latter into the eligibility-shortlist path.</w:t>
+      </w:r>
     </w:p>
     <w:p>
       <w:pPr>
@@ -629,7 +632,6 @@
         <w:t>Singapore NRIC/FIN-shaped identifiers are regex-redacted before any query reaches an LLM, including the rewriter.</w:t>
       </w:r>
     </w:p>
-    <w:p/>
     <w:p>
       <w:pPr>
         <w:pStyle w:val="ListBullet"/>
@@ -643,22 +645,6 @@
       </w:r>
       <w:r>
         <w:t>force-append retrieved-but-omitted schemes when a profile has a strong signal (e.g. an unemployed profile must surface SkillsFuture/ComCare/Workfare if those chunks were retrieved), and surface retrieved-but-unassessed schemes rather than returning an empty shortlist.</w:t>
-      </w:r>
-    </w:p>
-    <w:p>
-      <w:pPr>
-        <w:pStyle w:val="ListBullet"/>
-      </w:pPr>
-      <w:r>
-        <w:t>In-session chat history — General Q&amp;A and Personal Eligibility keep a short browser-tab conversation (sessionStorage, capped turns) plus a sticky profile; follow-ups such as “how much is that?” are rewritten into standalone retrieval queries. History is used only for reference resolution and is never treated as evidence for eligibility claims.</w:t>
-      </w:r>
-    </w:p>
-    <w:p>
-      <w:pPr>
-        <w:pStyle w:val="ListBullet"/>
-      </w:pPr>
-      <w:r>
-        <w:t>Freeform ↔ structured shortlist alignment — personal-situation free text in General Q&amp;A infers the same profile bands as the Personal Eligibility form, runs the same shortlist engine (profile-band retrieval seeds, unemployed → SkillsFuture/ComCare coverage nets), and can pre-fill the form ticks so both UIs return a consistent resident-facing shortlist.</w:t>
       </w:r>
     </w:p>
     <w:p>
@@ -1355,7 +1341,7 @@
           <w:i/>
           <w:sz w:val="19"/>
         </w:rPr>
-        <w:t>Run configuration: LLM gpt-5.4-mini via OpenAIClient; embedding model BAAI/bge-m3; top_k = 5; query rewrite off (to isolate the dense-vs-hybrid retrieval comparison); index of 385 documents / 1,809 chunks (same metadata.jsonl counts as §2); run date 30 July 2026.</w:t>
+        <w:t>Run configuration: LLM gpt-5.4-mini via OpenAIClient; embedding model BAAI/bge-m3; top_k = 5; query rewrite off (to isolate the dense-vs-hybrid retrieval comparison); index of 385 documents / 1,809 chunks; run date 30 July 2026.</w:t>
       </w:r>
     </w:p>
     <w:p>
@@ -2413,7 +2399,7 @@
           <w:i/>
           <w:sz w:val="19"/>
         </w:rPr>
-        <w:t>Responsibility areas follow the assignment brief. Names and key contributions are summarised in the table below (Group 2).</w:t>
+        <w:t>Suggested responsibility areas per the assignment brief; names and specific contributions to be completed by the group.</w:t>
       </w:r>
     </w:p>
     <w:tbl>
@@ -2487,8 +2473,12 @@
             <w:tcW w:type="dxa" w:w="2160"/>
           </w:tcPr>
           <w:p>
+            <w:r/>
             <w:r>
-              <w:t>Hongming</w:t>
+              <w:rPr>
+                <w:sz w:val="19"/>
+              </w:rPr>
+              <w:t>[Name]</w:t>
             </w:r>
           </w:p>
         </w:tc>
@@ -2497,7 +2487,11 @@
             <w:tcW w:type="dxa" w:w="2880"/>
           </w:tcPr>
           <w:p>
+            <w:r/>
             <w:r>
+              <w:rPr>
+                <w:sz w:val="19"/>
+              </w:rPr>
               <w:t>Data and ingestion</w:t>
             </w:r>
           </w:p>
@@ -2507,8 +2501,12 @@
             <w:tcW w:type="dxa" w:w="4320"/>
           </w:tcPr>
           <w:p>
+            <w:r/>
             <w:r>
-              <w:t>Document collection and cleaning; structure-aware chunking and optional LLM contextualization; metadata schema; multimodal ingestion (text/OCR/video transcription) into ChromaDB.</w:t>
+              <w:rPr>
+                <w:sz w:val="19"/>
+              </w:rPr>
+              <w:t>[Document collection, cleaning, chunking, metadata — fill in]</w:t>
             </w:r>
           </w:p>
         </w:tc>
@@ -2519,8 +2517,12 @@
             <w:tcW w:type="dxa" w:w="2160"/>
           </w:tcPr>
           <w:p>
+            <w:r/>
             <w:r>
-              <w:t>Max</w:t>
+              <w:rPr>
+                <w:sz w:val="19"/>
+              </w:rPr>
+              <w:t>[Name]</w:t>
             </w:r>
           </w:p>
         </w:tc>
@@ -2529,7 +2531,11 @@
             <w:tcW w:type="dxa" w:w="2880"/>
           </w:tcPr>
           <w:p>
+            <w:r/>
             <w:r>
+              <w:rPr>
+                <w:sz w:val="19"/>
+              </w:rPr>
               <w:t>Retrieval</w:t>
             </w:r>
           </w:p>
@@ -2539,8 +2545,12 @@
             <w:tcW w:type="dxa" w:w="4320"/>
           </w:tcPr>
           <w:p>
+            <w:r/>
             <w:r>
-              <w:t>BGE-M3 embeddings; Chroma dense baseline; BM25 + Reciprocal Rank Fusion hybrid retrieval; retrieval parameters, profile category re-ranking, and similarity abstention gate.</w:t>
+              <w:rPr>
+                <w:sz w:val="19"/>
+              </w:rPr>
+              <w:t>[Embeddings, vector store, search, retrieval parameters — fill in]</w:t>
             </w:r>
           </w:p>
         </w:tc>
@@ -2551,8 +2561,12 @@
             <w:tcW w:type="dxa" w:w="2160"/>
           </w:tcPr>
           <w:p>
+            <w:r/>
             <w:r>
-              <w:t>Huimin</w:t>
+              <w:rPr>
+                <w:sz w:val="19"/>
+              </w:rPr>
+              <w:t>[Name]</w:t>
             </w:r>
           </w:p>
         </w:tc>
@@ -2561,7 +2575,11 @@
             <w:tcW w:type="dxa" w:w="2880"/>
           </w:tcPr>
           <w:p>
+            <w:r/>
             <w:r>
+              <w:rPr>
+                <w:sz w:val="19"/>
+              </w:rPr>
               <w:t>Generation and application</w:t>
             </w:r>
           </w:p>
@@ -2571,8 +2589,12 @@
             <w:tcW w:type="dxa" w:w="4320"/>
           </w:tcPr>
           <w:p>
+            <w:r/>
             <w:r>
-              <w:t>Prompt design and grounded answer generation; eligibility shortlist assessor; citations/UI; FastAPI backend and resident-facing frontend (including later chat-history and shortlist alignment work).</w:t>
+              <w:rPr>
+                <w:sz w:val="19"/>
+              </w:rPr>
+              <w:t>[Prompt design, answer generation, citations, UI — fill in]</w:t>
             </w:r>
           </w:p>
         </w:tc>
@@ -2583,8 +2605,12 @@
             <w:tcW w:type="dxa" w:w="2160"/>
           </w:tcPr>
           <w:p>
+            <w:r/>
             <w:r>
-              <w:t>Jony</w:t>
+              <w:rPr>
+                <w:sz w:val="19"/>
+              </w:rPr>
+              <w:t>[Name]</w:t>
             </w:r>
           </w:p>
         </w:tc>
@@ -2593,7 +2619,11 @@
             <w:tcW w:type="dxa" w:w="2880"/>
           </w:tcPr>
           <w:p>
+            <w:r/>
             <w:r>
+              <w:rPr>
+                <w:sz w:val="19"/>
+              </w:rPr>
               <w:t>Evaluation and testing</w:t>
             </w:r>
           </w:p>
@@ -2603,8 +2633,12 @@
             <w:tcW w:type="dxa" w:w="4320"/>
           </w:tcPr>
           <w:p>
+            <w:r/>
             <w:r>
-              <w:t>Hand-labelled evaluation set; dense vs hybrid metrics and failure analysis; evaluation report; local reliability fixes, personal-eligibility parity testing, and rubric scoring.</w:t>
+              <w:rPr>
+                <w:sz w:val="19"/>
+              </w:rPr>
+              <w:t>[Test dataset, metrics, failure analysis, improvement — fill in]</w:t>
             </w:r>
           </w:p>
         </w:tc>

</xml_diff>